<commit_message>
Add level selection and branching restoration woodland
Choose either journey from startup, with separate saves and Continue. Explore a second wood of long curling paths, collect three reusable healing tools, revisit damaged land to open shortcuts, and play a final song at the Joined Grove.

Retains the original valley, full playable instrument, scenes and native assets. Verified in Godot 4.7.2 with continuous controller-driven progression, shortcut and gate reachability, save isolation, both menu routes, original-valley regression suites, and native rendered captures.
</commit_message>
<xml_diff>
--- a/docs/ProjectNVS_Woodland_Expansion.docx
+++ b/docs/ProjectNVS_Woodland_Expansion.docx
@@ -15,7 +15,7 @@
         <w:pStyle w:val="Subtitle"/>
       </w:pPr>
       <w:r>
-        <w:t>Design addendum 0.3  |  28 October 2026  |  Director Jonathan Sanders</w:t>
+        <w:t>Design addendum 0.4  |  28 October 2026  |  Director Jonathan Sanders</w:t>
       </w:r>
     </w:p>
     <w:p>
@@ -1652,7 +1652,7 @@
         <w:pStyle w:val="Heading2"/>
       </w:pPr>
       <w:r>
-        <w:t>Current verification and limits</w:t>
+        <w:t>Far woodland verification and limits</w:t>
       </w:r>
     </w:p>
     <w:p>
@@ -1673,6 +1673,501 @@
     <w:p>
       <w:r>
         <w:t>S4  Director request, 27 October 2026. Revision 0.3 completed on 28 October 2026 preserves the earlier design and evidence, records H007 and the current map implementation, and keeps publication separate from verification. The source baseline was recovered from ProjectNVS_Woodland_Source_74fb1e5.zip.</w:t>
+      </w:r>
+    </w:p>
+    <w:p>
+      <w:pPr>
+        <w:pStyle w:val="Heading1"/>
+        <w:pageBreakBefore/>
+      </w:pPr>
+      <w:r>
+        <w:t>The Returning Wood second level</w:t>
+      </w:r>
+    </w:p>
+    <w:p>
+      <w:r>
+        <w:t>H008 is the director's approved request of 28 October 2026 for a startup level selector and a second level with long branching, curling paths, unlockable shortcuts and returns to earlier objectives with items that heal the land. The Returning Wood title, tool names, healing recipes and exact gates are AI implementation choices within that request. No further mythology or Artemis storyline is adopted here.</w:t>
+      </w:r>
+    </w:p>
+    <w:p>
+      <w:pPr>
+        <w:pStyle w:val="Heading2"/>
+      </w:pPr>
+      <w:r>
+        <w:t>Choose and keep each journey</w:t>
+      </w:r>
+    </w:p>
+    <w:p>
+      <w:r>
+        <w:t>Startup offers Begin and, when a save exists, Continue for each level. Replacing an existing journey requires a second click for that level. Pause can return to the selector. The Quiet Bloom keeps journey.json; The Returning Wood keeps secondwood.json. Their positions and progress remain independent. The second level reuses the native faun, keyboard, pipe audio and woodland cast, with its own route map and quest state.</w:t>
+      </w:r>
+    </w:p>
+    <w:p>
+      <w:pPr>
+        <w:pStyle w:val="Heading2"/>
+      </w:pPr>
+      <w:r>
+        <w:t>Find tools and revisit the wounds</w:t>
+      </w:r>
+    </w:p>
+    <w:p>
+      <w:r>
+        <w:t>A turning glade branches into western and eastern curls. The three damaged places are visible near the hub before their tools are found. Eight authored paths and three shortcuts occupy a bordered corridor network inside 180 by 180 unit bounds; their combined centerline length is 1,068.86 units. Banks and blocked roots describe the routes, while native walkability prevents crossing locked ground.</w:t>
+      </w:r>
+    </w:p>
+    <w:tbl>
+      <w:tblPr>
+        <w:tblW w:type="auto" w:w="0"/>
+        <w:tblLayout w:type="fixed"/>
+        <w:tblLook w:firstColumn="1" w:firstRow="1" w:lastColumn="0" w:lastRow="0" w:noHBand="0" w:noVBand="1" w:val="04A0"/>
+        <w:tblBorders>
+          <w:top w:val="single" w:sz="4" w:color="D9D9D9"/>
+          <w:left w:val="single" w:sz="4" w:color="D9D9D9"/>
+          <w:bottom w:val="single" w:sz="4" w:color="D9D9D9"/>
+          <w:right w:val="single" w:sz="4" w:color="D9D9D9"/>
+          <w:insideH w:val="single" w:sz="4" w:color="D9D9D9"/>
+          <w:insideV w:val="single" w:sz="4" w:color="D9D9D9"/>
+        </w:tblBorders>
+      </w:tblPr>
+      <w:tblGrid>
+        <w:gridCol w:w="1872"/>
+        <w:gridCol w:w="2333"/>
+        <w:gridCol w:w="2333"/>
+        <w:gridCol w:w="3485"/>
+      </w:tblGrid>
+      <w:tr>
+        <w:trPr>
+          <w:tblHeader/>
+        </w:trPr>
+        <w:tc>
+          <w:tcPr>
+            <w:tcW w:type="dxa" w:w="1872"/>
+            <w:vAlign w:val="center"/>
+            <w:tcMar>
+              <w:top w:w="85" w:type="dxa"/>
+              <w:left w:w="85" w:type="dxa"/>
+              <w:bottom w:w="85" w:type="dxa"/>
+              <w:right w:w="85" w:type="dxa"/>
+            </w:tcMar>
+            <w:shd w:fill="39443F"/>
+          </w:tcPr>
+          <w:p>
+            <w:pPr>
+              <w:spacing w:after="40" w:line="247" w:lineRule="auto"/>
+            </w:pPr>
+            <w:r>
+              <w:rPr>
+                <w:b/>
+                <w:color w:val="FFFFFF"/>
+                <w:sz w:val="18"/>
+              </w:rPr>
+              <w:t>Reusable tool</w:t>
+            </w:r>
+          </w:p>
+        </w:tc>
+        <w:tc>
+          <w:tcPr>
+            <w:tcW w:type="dxa" w:w="2333"/>
+            <w:vAlign w:val="center"/>
+            <w:tcMar>
+              <w:top w:w="85" w:type="dxa"/>
+              <w:left w:w="85" w:type="dxa"/>
+              <w:bottom w:w="85" w:type="dxa"/>
+              <w:right w:w="85" w:type="dxa"/>
+            </w:tcMar>
+            <w:shd w:fill="39443F"/>
+          </w:tcPr>
+          <w:p>
+            <w:pPr>
+              <w:spacing w:after="40" w:line="247" w:lineRule="auto"/>
+            </w:pPr>
+            <w:r>
+              <w:rPr>
+                <w:b/>
+                <w:color w:val="FFFFFF"/>
+                <w:sz w:val="18"/>
+              </w:rPr>
+              <w:t>Find it</w:t>
+            </w:r>
+          </w:p>
+        </w:tc>
+        <w:tc>
+          <w:tcPr>
+            <w:tcW w:type="dxa" w:w="2333"/>
+            <w:vAlign w:val="center"/>
+            <w:tcMar>
+              <w:top w:w="85" w:type="dxa"/>
+              <w:left w:w="85" w:type="dxa"/>
+              <w:bottom w:w="85" w:type="dxa"/>
+              <w:right w:w="85" w:type="dxa"/>
+            </w:tcMar>
+            <w:shd w:fill="39443F"/>
+          </w:tcPr>
+          <w:p>
+            <w:pPr>
+              <w:spacing w:after="40" w:line="247" w:lineRule="auto"/>
+            </w:pPr>
+            <w:r>
+              <w:rPr>
+                <w:b/>
+                <w:color w:val="FFFFFF"/>
+                <w:sz w:val="18"/>
+              </w:rPr>
+              <w:t>Return and heal</w:t>
+            </w:r>
+          </w:p>
+        </w:tc>
+        <w:tc>
+          <w:tcPr>
+            <w:tcW w:type="dxa" w:w="3485"/>
+            <w:vAlign w:val="center"/>
+            <w:tcMar>
+              <w:top w:w="85" w:type="dxa"/>
+              <w:left w:w="85" w:type="dxa"/>
+              <w:bottom w:w="85" w:type="dxa"/>
+              <w:right w:w="85" w:type="dxa"/>
+            </w:tcMar>
+            <w:shd w:fill="39443F"/>
+          </w:tcPr>
+          <w:p>
+            <w:pPr>
+              <w:spacing w:after="40" w:line="247" w:lineRule="auto"/>
+            </w:pPr>
+            <w:r>
+              <w:rPr>
+                <w:b/>
+                <w:color w:val="FFFFFF"/>
+                <w:sz w:val="18"/>
+              </w:rPr>
+              <w:t>Route change</w:t>
+            </w:r>
+          </w:p>
+        </w:tc>
+      </w:tr>
+      <w:tr>
+        <w:tc>
+          <w:tcPr>
+            <w:tcW w:type="dxa" w:w="1872"/>
+            <w:vAlign w:val="center"/>
+            <w:tcMar>
+              <w:top w:w="85" w:type="dxa"/>
+              <w:left w:w="85" w:type="dxa"/>
+              <w:bottom w:w="85" w:type="dxa"/>
+              <w:right w:w="85" w:type="dxa"/>
+            </w:tcMar>
+            <w:shd w:fill="FFFFFF"/>
+          </w:tcPr>
+          <w:p>
+            <w:pPr>
+              <w:spacing w:after="40" w:line="247" w:lineRule="auto"/>
+            </w:pPr>
+            <w:r>
+              <w:rPr>
+                <w:sz w:val="18"/>
+              </w:rPr>
+              <w:t>Spring Vessel</w:t>
+            </w:r>
+          </w:p>
+        </w:tc>
+        <w:tc>
+          <w:tcPr>
+            <w:tcW w:type="dxa" w:w="2333"/>
+            <w:vAlign w:val="center"/>
+            <w:tcMar>
+              <w:top w:w="85" w:type="dxa"/>
+              <w:left w:w="85" w:type="dxa"/>
+              <w:bottom w:w="85" w:type="dxa"/>
+              <w:right w:w="85" w:type="dxa"/>
+            </w:tcMar>
+            <w:shd w:fill="FFFFFF"/>
+          </w:tcPr>
+          <w:p>
+            <w:pPr>
+              <w:spacing w:after="40" w:line="247" w:lineRule="auto"/>
+            </w:pPr>
+            <w:r>
+              <w:rPr>
+                <w:sz w:val="18"/>
+              </w:rPr>
+              <w:t>Western curl</w:t>
+            </w:r>
+          </w:p>
+        </w:tc>
+        <w:tc>
+          <w:tcPr>
+            <w:tcW w:type="dxa" w:w="2333"/>
+            <w:vAlign w:val="center"/>
+            <w:tcMar>
+              <w:top w:w="85" w:type="dxa"/>
+              <w:left w:w="85" w:type="dxa"/>
+              <w:bottom w:w="85" w:type="dxa"/>
+              <w:right w:w="85" w:type="dxa"/>
+            </w:tcMar>
+            <w:shd w:fill="FFFFFF"/>
+          </w:tcPr>
+          <w:p>
+            <w:pPr>
+              <w:spacing w:after="40" w:line="247" w:lineRule="auto"/>
+            </w:pPr>
+            <w:r>
+              <w:rPr>
+                <w:sz w:val="18"/>
+              </w:rPr>
+              <w:t>The Dry Source</w:t>
+            </w:r>
+          </w:p>
+        </w:tc>
+        <w:tc>
+          <w:tcPr>
+            <w:tcW w:type="dxa" w:w="3485"/>
+            <w:vAlign w:val="center"/>
+            <w:tcMar>
+              <w:top w:w="85" w:type="dxa"/>
+              <w:left w:w="85" w:type="dxa"/>
+              <w:bottom w:w="85" w:type="dxa"/>
+              <w:right w:w="85" w:type="dxa"/>
+            </w:tcMar>
+            <w:shd w:fill="FFFFFF"/>
+          </w:tcPr>
+          <w:p>
+            <w:pPr>
+              <w:spacing w:after="40" w:line="247" w:lineRule="auto"/>
+            </w:pPr>
+            <w:r>
+              <w:rPr>
+                <w:sz w:val="18"/>
+              </w:rPr>
+              <w:t>Western shortcut and northern spiral open</w:t>
+            </w:r>
+          </w:p>
+        </w:tc>
+      </w:tr>
+      <w:tr>
+        <w:tc>
+          <w:tcPr>
+            <w:tcW w:type="dxa" w:w="1872"/>
+            <w:vAlign w:val="center"/>
+            <w:tcMar>
+              <w:top w:w="85" w:type="dxa"/>
+              <w:left w:w="85" w:type="dxa"/>
+              <w:bottom w:w="85" w:type="dxa"/>
+              <w:right w:w="85" w:type="dxa"/>
+            </w:tcMar>
+            <w:shd w:fill="F2F5F4"/>
+          </w:tcPr>
+          <w:p>
+            <w:pPr>
+              <w:spacing w:after="40" w:line="247" w:lineRule="auto"/>
+            </w:pPr>
+            <w:r>
+              <w:rPr>
+                <w:sz w:val="18"/>
+              </w:rPr>
+              <w:t>Living Spore</w:t>
+            </w:r>
+          </w:p>
+        </w:tc>
+        <w:tc>
+          <w:tcPr>
+            <w:tcW w:type="dxa" w:w="2333"/>
+            <w:vAlign w:val="center"/>
+            <w:tcMar>
+              <w:top w:w="85" w:type="dxa"/>
+              <w:left w:w="85" w:type="dxa"/>
+              <w:bottom w:w="85" w:type="dxa"/>
+              <w:right w:w="85" w:type="dxa"/>
+            </w:tcMar>
+            <w:shd w:fill="F2F5F4"/>
+          </w:tcPr>
+          <w:p>
+            <w:pPr>
+              <w:spacing w:after="40" w:line="247" w:lineRule="auto"/>
+            </w:pPr>
+            <w:r>
+              <w:rPr>
+                <w:sz w:val="18"/>
+              </w:rPr>
+              <w:t>Eastern curl</w:t>
+            </w:r>
+          </w:p>
+        </w:tc>
+        <w:tc>
+          <w:tcPr>
+            <w:tcW w:type="dxa" w:w="2333"/>
+            <w:vAlign w:val="center"/>
+            <w:tcMar>
+              <w:top w:w="85" w:type="dxa"/>
+              <w:left w:w="85" w:type="dxa"/>
+              <w:bottom w:w="85" w:type="dxa"/>
+              <w:right w:w="85" w:type="dxa"/>
+            </w:tcMar>
+            <w:shd w:fill="F2F5F4"/>
+          </w:tcPr>
+          <w:p>
+            <w:pPr>
+              <w:spacing w:after="40" w:line="247" w:lineRule="auto"/>
+            </w:pPr>
+            <w:r>
+              <w:rPr>
+                <w:sz w:val="18"/>
+              </w:rPr>
+              <w:t>The Sealed Hollow</w:t>
+            </w:r>
+          </w:p>
+        </w:tc>
+        <w:tc>
+          <w:tcPr>
+            <w:tcW w:type="dxa" w:w="3485"/>
+            <w:vAlign w:val="center"/>
+            <w:tcMar>
+              <w:top w:w="85" w:type="dxa"/>
+              <w:left w:w="85" w:type="dxa"/>
+              <w:bottom w:w="85" w:type="dxa"/>
+              <w:right w:w="85" w:type="dxa"/>
+            </w:tcMar>
+            <w:shd w:fill="F2F5F4"/>
+          </w:tcPr>
+          <w:p>
+            <w:pPr>
+              <w:spacing w:after="40" w:line="247" w:lineRule="auto"/>
+            </w:pPr>
+            <w:r>
+              <w:rPr>
+                <w:sz w:val="18"/>
+              </w:rPr>
+              <w:t>Eastern shortcut opens</w:t>
+            </w:r>
+          </w:p>
+        </w:tc>
+      </w:tr>
+      <w:tr>
+        <w:tc>
+          <w:tcPr>
+            <w:tcW w:type="dxa" w:w="1872"/>
+            <w:vAlign w:val="center"/>
+            <w:tcMar>
+              <w:top w:w="85" w:type="dxa"/>
+              <w:left w:w="85" w:type="dxa"/>
+              <w:bottom w:w="85" w:type="dxa"/>
+              <w:right w:w="85" w:type="dxa"/>
+            </w:tcMar>
+            <w:shd w:fill="FFFFFF"/>
+          </w:tcPr>
+          <w:p>
+            <w:pPr>
+              <w:spacing w:after="40" w:line="247" w:lineRule="auto"/>
+            </w:pPr>
+            <w:r>
+              <w:rPr>
+                <w:sz w:val="18"/>
+              </w:rPr>
+              <w:t>Rootheart Spindle</w:t>
+            </w:r>
+          </w:p>
+        </w:tc>
+        <w:tc>
+          <w:tcPr>
+            <w:tcW w:type="dxa" w:w="2333"/>
+            <w:vAlign w:val="center"/>
+            <w:tcMar>
+              <w:top w:w="85" w:type="dxa"/>
+              <w:left w:w="85" w:type="dxa"/>
+              <w:bottom w:w="85" w:type="dxa"/>
+              <w:right w:w="85" w:type="dxa"/>
+            </w:tcMar>
+            <w:shd w:fill="FFFFFF"/>
+          </w:tcPr>
+          <w:p>
+            <w:pPr>
+              <w:spacing w:after="40" w:line="247" w:lineRule="auto"/>
+            </w:pPr>
+            <w:r>
+              <w:rPr>
+                <w:sz w:val="18"/>
+              </w:rPr>
+              <w:t>Northern spiral after the source heals</w:t>
+            </w:r>
+          </w:p>
+        </w:tc>
+        <w:tc>
+          <w:tcPr>
+            <w:tcW w:type="dxa" w:w="2333"/>
+            <w:vAlign w:val="center"/>
+            <w:tcMar>
+              <w:top w:w="85" w:type="dxa"/>
+              <w:left w:w="85" w:type="dxa"/>
+              <w:bottom w:w="85" w:type="dxa"/>
+              <w:right w:w="85" w:type="dxa"/>
+            </w:tcMar>
+            <w:shd w:fill="FFFFFF"/>
+          </w:tcPr>
+          <w:p>
+            <w:pPr>
+              <w:spacing w:after="40" w:line="247" w:lineRule="auto"/>
+            </w:pPr>
+            <w:r>
+              <w:rPr>
+                <w:sz w:val="18"/>
+              </w:rPr>
+              <w:t>The Ash Scar</w:t>
+            </w:r>
+          </w:p>
+        </w:tc>
+        <w:tc>
+          <w:tcPr>
+            <w:tcW w:type="dxa" w:w="3485"/>
+            <w:vAlign w:val="center"/>
+            <w:tcMar>
+              <w:top w:w="85" w:type="dxa"/>
+              <w:left w:w="85" w:type="dxa"/>
+              <w:bottom w:w="85" w:type="dxa"/>
+              <w:right w:w="85" w:type="dxa"/>
+            </w:tcMar>
+            <w:shd w:fill="FFFFFF"/>
+          </w:tcPr>
+          <w:p>
+            <w:pPr>
+              <w:spacing w:after="40" w:line="247" w:lineRule="auto"/>
+            </w:pPr>
+            <w:r>
+              <w:rPr>
+                <w:sz w:val="18"/>
+              </w:rPr>
+              <w:t>Northern shortcut opens</w:t>
+            </w:r>
+          </w:p>
+        </w:tc>
+      </w:tr>
+    </w:tbl>
+    <w:p>
+      <w:pPr>
+        <w:spacing w:before="120"/>
+      </w:pPr>
+      <w:r>
+        <w:t>Approach a tool to collect it, then lower the pipes and press E near its matching wound. For example, find the vessel along the western curl, carry it back to the dry source, then follow the newly opened northern walk. Interacting without the needed tool explains what is missing and leaves progress intact. Tools remain in the inventory after use. Returning water, small growth, particles and woodland residents show recovery.</w:t>
+      </w:r>
+    </w:p>
+    <w:p>
+      <w:r>
+        <w:t>The final route opens after all three healings. At the Joined Grove, raise the pipes with Tab and play Q E U I U E Q in any octave. The journal shows inventory, places to revisit and a map with open and closed routes. The MBean1 keyboard remains freely playable.</w:t>
+      </w:r>
+    </w:p>
+    <w:p>
+      <w:pPr>
+        <w:pStyle w:val="Heading2"/>
+      </w:pPr>
+      <w:r>
+        <w:t>Verification and the next playtest</w:t>
+      </w:r>
+    </w:p>
+    <w:p>
+      <w:r>
+        <w:t>Native progression passes 82 checks and walks 2,304.85 units through the quest with no spatial relocation. Healing and the finale use physical keyboard events; disk saves, Continue and selection are exercised. Traversal passes 71 checks across 2,233 centerline samples and full-floor gate reachability. All eleven route sections are walked outward and back over 2,137.25 units, using eleven starting relocations. Evidence is in secondwood-progression-verification.json and secondwood-traversal-verification.json.</w:t>
+      </w:r>
+    </w:p>
+    <w:p>
+      <w:r>
+        <w:t>Human playtesting still needs to assess first-time route reading, whether the first long returns feel worthwhile, and whether shortcuts make later visits easier. Target-hardware performance is unmeasured. The note highway, Artemis' human form and the wider mythological conflict remain deferred. S5 is the director's 28 October request; revision 0.4 preserves the earlier pages and adds H008 and this scoped implementation record.</w:t>
       </w:r>
     </w:p>
     <w:sectPr>

</xml_diff>

<commit_message>
Plan Artemis relic quest and triple-sized woodland for Terra
Add a concrete implementation handoff for roughly three times the second-level area and route length, nine shortcuts, two reusable relic interactions and an Artemis planting-and-return quest. Includes state migration, staged construction and acceptance criteria.

Planning-only change. The map and quest are not claimed as implemented.
</commit_message>
<xml_diff>
--- a/docs/ProjectNVS_Woodland_Expansion.docx
+++ b/docs/ProjectNVS_Woodland_Expansion.docx
@@ -15,7 +15,7 @@
         <w:pStyle w:val="Subtitle"/>
       </w:pPr>
       <w:r>
-        <w:t>Design addendum 0.4  |  28 October 2026  |  Director Jonathan Sanders</w:t>
+        <w:t>Design addendum 0.5  |  28 October 2026  |  Director Jonathan Sanders</w:t>
       </w:r>
     </w:p>
     <w:p>
@@ -2170,6 +2170,287 @@
         <w:t>Human playtesting still needs to assess first-time route reading, whether the first long returns feel worthwhile, and whether shortcuts make later visits easier. Target-hardware performance is unmeasured. The note highway, Artemis' human form and the wider mythological conflict remain deferred. S5 is the director's 28 October request; revision 0.4 preserves the earlier pages and adds H008 and this scoped implementation record.</w:t>
       </w:r>
     </w:p>
+    <w:p>
+      <w:pPr>
+        <w:pStyle w:val="Heading1"/>
+        <w:pageBreakBefore/>
+      </w:pPr>
+      <w:r>
+        <w:t>Artemis expansion plan for Terra</w:t>
+      </w:r>
+    </w:p>
+    <w:p>
+      <w:r>
+        <w:t>Planning revision 0.5, 28 October 2026. Not implemented or tested.</w:t>
+      </w:r>
+    </w:p>
+    <w:p>
+      <w:pPr>
+        <w:pStyle w:val="Heading2"/>
+      </w:pPr>
+      <w:r>
+        <w:t>Authority and baseline</w:t>
+      </w:r>
+    </w:p>
+    <w:p>
+      <w:r>
+        <w:t>H009 is the human request to triple Level 2, add shortcuts and relic interactions, and plan an Artemis questline for Terra to implement. Terra means the implementation agent, not a newly named player character. Retain the faun and the existing giant-deer Artemis. Detailed names, rules, dimensions and placements below are AI design proposals within that scope. Do not introduce a villain, combat, or Artemis's human form in this milestone.</w:t>
+      </w:r>
+    </w:p>
+    <w:p>
+      <w:r>
+        <w:t>Start from the latest main of eyehaveewe-cyber/ProjectNVS. The inspected baseline is 3e7ce1abb0f7743dfe79682dffcbd21464244dab. Preserve later changes if main advances. The current second level has 180x180 bounds, 1,068.86 units of paths, three healing tools, three shortcuts, and a separate secondwood.json save. The first valley and its save must remain playable.</w:t>
+      </w:r>
+    </w:p>
+    <w:p>
+      <w:pPr>
+        <w:pStyle w:val="Heading2"/>
+      </w:pPr>
+      <w:r>
+        <w:t>Size and spatial contract</w:t>
+      </w:r>
+    </w:p>
+    <w:p>
+      <w:r>
+        <w:t>Interpret three times larger as roughly three times bounded area AND authored walking capacity, not three times each dimension. Use BOUNDS=156, giving 312x312 and 97,344 square units, versus 32,400 now. Target total unique authored centerline length 3,200 units, acceptable provisional range 3,050–3,350 including shortcuts. This is a corridor network, not 97,344 units of walkable ground. Measure actual route length and walkable corridor coverage; multiplying bounds alone is not completion. Keep speed 3.2/4.5 and camera controls initially unchanged.</w:t>
+      </w:r>
+    </w:p>
+    <w:p>
+      <w:r>
+        <w:t>Keep ENTRY(0,65), HUB(0,40), existing site/item IDs and positions, original paths, and all three original shortcuts. Append new regions rather than uniformly scaling the old world. Keep corridor width 5.2 units unless controller/camera tests justify a local change.</w:t>
+      </w:r>
+    </w:p>
+    <w:p>
+      <w:r>
+        <w:t>Add a western wetland loop around (-122,10), an eastern burned-wood loop around (122,-15), and a northern ridge around (0,-130). A southern return walk around z=120 should connect the outer branches without funneling every trip through the hub. These are provisional region envelopes, not final route vertices. Keep all corridor edges and clearing rims inside bounds. Author curling outer approaches, visible inner return routes, and clear landmark silhouettes. Forest banks, terrain and roots must visibly explain every collision boundary. Preserve calm walking intervals; do not place a collectible at every bend.</w:t>
+      </w:r>
+    </w:p>
+    <w:p>
+      <w:r>
+        <w:t>Compare a ring with radial cuts against a chain of nested loops during blockout. Prefer nested loops with cross-region returns: a plain enlarged ring adds travel but little discovery. Do not finalize scenery until both outward and return travel work.</w:t>
+      </w:r>
+    </w:p>
+    <w:p>
+      <w:pPr>
+        <w:pStyle w:val="Heading2"/>
+      </w:pPr>
+      <w:r>
+        <w:t>Nine shortcuts</w:t>
+      </w:r>
+    </w:p>
+    <w:p>
+      <w:r>
+        <w:t>Retain source-cut, hollow-cut and ash-cut with their existing IDs and unlocks. Add the following six stable IDs. Exact endpoints are Terra's blockout decisions and must be recorded with measured detour savings before art placement.</w:t>
+      </w:r>
+    </w:p>
+    <w:p>
+      <w:r>
+        <w:t>west-sluice: outer wetland to the Dry Source. Repair its far-side sluice with the Spring Vessel. Opens permanently; visible from the source beforehand.</w:t>
+      </w:r>
+    </w:p>
+    <w:p>
+      <w:r>
+        <w:t>west-ridge-roots: wetland inner loop to northern ridge. Attune the Moon Lens at the restored source, then illuminate the buried crossing from its western plinth.</w:t>
+      </w:r>
+    </w:p>
+    <w:p>
+      <w:r>
+        <w:t>east-root-bridge: eastern outer loop to the ridge approach. Join three local root anchors with the Root Spool. This is the first taught spool repair.</w:t>
+      </w:r>
+    </w:p>
+    <w:p>
+      <w:r>
+        <w:t>ash-east-cut: Ash Scar to the eastern inner loop. Requires healed ash and a second Root Spool repair. Offers a later use of a familiar relic.</w:t>
+      </w:r>
+    </w:p>
+    <w:p>
+      <w:r>
+        <w:t>south-return: outer east to outer west through the southern walk. Open a mechanical root latch from its far side; no relic required. It rewards exploration and gives a recovery route before the late quest.</w:t>
+      </w:r>
+    </w:p>
+    <w:p>
+      <w:r>
+        <w:t>ridge-descent: Crown Clearing to the old northern spiral's inner arm. Open from the ridge side after planting the acorn. It supports the final return to Artemis and later wandering.</w:t>
+      </w:r>
+    </w:p>
+    <w:p>
+      <w:r>
+        <w:t>Opening a shortcut changes actual walkability, root/bridge geometry, sign text and the journal map together. A closed sign must disappear or change when the route opens. Every shortcut is bidirectional after unlocking. Aim for at least 40 percent less walking between its endpoints than the best previously available route; measure the full graph, not straight-line distance. Revise a redundant link instead of keeping it to meet a count.</w:t>
+      </w:r>
+    </w:p>
+    <w:p>
+      <w:pPr>
+        <w:pStyle w:val="Heading2"/>
+      </w:pPr>
+      <w:r>
+        <w:t>Artemis questline</w:t>
+      </w:r>
+    </w:p>
+    <w:p>
+      <w:r>
+        <w:t>1. A wood that cannot carry water. Artemis appears at the Turning Glade from the start of this level, independent of the first valley's Artemis encounter. E begins her request to restore the Dry Source, Sealed Hollow and Ash Scar using the current tools. Existing completed healings count immediately. Suggested line: “The roots remember one another. Their paths have forgotten how.” Keep the keeper as a useful local hint source.</w:t>
+      </w:r>
+    </w:p>
+    <w:p>
+      <w:r>
+        <w:t>2. Two ways to listen. After the source heals, Artemis reveals two relic leads. The Moon Lens lies in the western wetland; clean water from the reusable Spring Vessel removes its coating. The Root Spool lies in the eastern burned wood; the Living Spore wakes the roots holding it. Either relic branch can be completed first. Discovering a relic early gives a named hint and a safe revisit objective. Returning to Artemis after both is allowed; do not require an audience after every small action.</w:t>
+      </w:r>
+    </w:p>
+    <w:p>
+      <w:r>
+        <w:t>3. Mend the crossings. Attune and use each relic as specified below. Artemis asks the faun to reconnect one western and one eastern route. The player has already seen these severed crossings on the outward walk. The journal tracks the actual crossing IDs, not an arbitrary number of optional shortcuts. Completing both is the requirement for the next stage.</w:t>
+      </w:r>
+    </w:p>
+    <w:p>
+      <w:r>
+        <w:t>4. Carry a future. Artemis entrusts one dormant acorn after the two crossings and all three original healings. Carry it through the newly connected ridge to Crown Clearing. Plant it with the Rootheart Spindle. The spindle remains reusable; the acorn becomes a persistent planted world object, not a discardable item. Save immediately before and after planting. Never allow the unique acorn to be dropped or spent elsewhere.</w:t>
+      </w:r>
+    </w:p>
+    <w:p>
+      <w:r>
+        <w:t>5. Return under the young canopy. New roots open ridge-descent. Return to Artemis by the changed route. The familiar finale phrase Q E U I U E Q remains the musical conclusion, now offered at her final meeting. The reward is visible young canopy growth, returning creatures, a brief deer acknowledgment and free exploration. Do not instantly replace scorched woodland with mature forest. The old Joined Grove remains a valid place to play and visit.</w:t>
+      </w:r>
+    </w:p>
+    <w:p>
+      <w:r>
+        <w:t>Use short contextual conversations and visible land changes. No timed delivery, combat punishment, forced teleport, or repeated inventory hand-in is needed.</w:t>
+      </w:r>
+    </w:p>
+    <w:p>
+      <w:pPr>
+        <w:pStyle w:val="Heading2"/>
+      </w:pPr>
+      <w:r>
+        <w:t>Relic interactions</w:t>
+      </w:r>
+    </w:p>
+    <w:p>
+      <w:r>
+        <w:t>Moon Lens is a reusable reveal tool, not a door key. At the restored source, E seats it on the indicated plinth and clean water clarifies its surface. At a marked crossing plinth, E focuses the lens. Raising the pipes and sustaining natural D in any octave for 1.5 seconds makes a visible beam trace buried roots. Successful attunement makes that crossing permanently traversable. Releasing early loses only current hold progress; wrong notes do not remove inventory or completed flags. Pause, mute, focus loss and lowering pipes release notes and clear an incomplete hold. Offer a toggle-hold equivalent and a visible progress arc so audio precision or sustained key pressure is not mandatory. Free playing away from an active plinth must not trigger the relic.</w:t>
+      </w:r>
+    </w:p>
+    <w:p>
+      <w:r>
+        <w:t>Root Spool is a reusable spatial repair. E at a severed bridge starts a three-anchor local repair with visible next-anchor guidance. Walk to each existing stump and press E to bind it. Partial anchor completion persists and can be resumed; leaving the area does not reset it. On the third binding, roots physically connect the gap and its route opens. Show the resulting connection, not only a toast. A second repair at ash-east-cut demonstrates reuse. Keep each local anchor circuit short enough to see its purpose; its challenge is reading and reconnecting space, not another long fetch trip.</w:t>
+      </w:r>
+    </w:p>
+    <w:p>
+      <w:r>
+        <w:t>The acorn is the quest's unique planting object. Its reveal/possession/planted states are distinct. Planting requires the specified clearing, the spindle, all original healings and both required relic crossings. Invalid use explains the missing condition without consuming anything. A saved planted state owns the sapling's geometry and the ridge-descent unlock.</w:t>
+      </w:r>
+    </w:p>
+    <w:p>
+      <w:pPr>
+        <w:pStyle w:val="Heading2"/>
+      </w:pPr>
+      <w:r>
+        <w:t>Implementation contract</w:t>
+      </w:r>
+    </w:p>
+    <w:p>
+      <w:r>
+        <w:t>Keep layout, state, presentation and file persistence separate using the existing secondwood modules. Add an Artemis controller/dialogue view only if that isolates actual behavior; avoid a wrapper that merely forwards calls. Reuse woodland_cast.gd's deer and existing music/keyboard behavior. Do not copy first-level quest state or make second-level access depend on journey.json.</w:t>
+      </w:r>
+    </w:p>
+    <w:p>
+      <w:r>
+        <w:t>Replace single-string route requirements with arrays of required stable flags, all-of semantics. Derive capability flags from authoritative inventory, healed land, relic attunements, completed crossings and planted acorn state. Represent alternatives with authored alternate routes; do not invent a string-expression parser. Migrate every layout/map/overview/test caller together. Geometry, collision, UI and saves must consume the same requirement evaluator.</w:t>
+      </w:r>
+    </w:p>
+    <w:p>
+      <w:r>
+        <w:t>Suggested state fields: existing inventory/healed/won; artemis_accepted boolean; relic_attunements array; crossings_complete array; repair_anchors dictionary keyed by repair ID with completed anchor IDs; acorn_state enum absent/carried/planted; artemis_finale_done boolean. Derive the displayed quest step from those facts. Avoid maintaining a second independent numeric quest stage. Ephemeral hold time, focused plinth and active note handles are not saved.</w:t>
+      </w:r>
+    </w:p>
+    <w:p>
+      <w:r>
+        <w:t>Provide commands accept_artemis_quest(), activate_relic_target(target_id), bind_anchor(repair_id,anchor_id), plant_acorn(), and finish_artemis_song(). Validate distance, supported IDs and prerequisites at the gameplay boundary. Each successful action returns an explicit event for world feedback and immediate saving; duplicate actions are harmless. The state model must be testable without geometry. Keep keyboard performance and E interaction modes distinct.</w:t>
+      </w:r>
+    </w:p>
+    <w:p>
+      <w:r>
+        <w:t>Upgrade secondwood save version to 2. Preserve all version-1 positions, original item/healing/shortcut IDs and old won flag. Derive old shortcut access from the existing healed IDs. A previously completed player must still be able to accept Artemis's new quest; old won does not imply relic ownership or the expanded finale. If an old or malformed position is not walkable under restored flags, move to the nearest reachable authored safe point, with entry as fallback. No reset of the first valley or of valid earlier progress.</w:t>
+      </w:r>
+    </w:p>
+    <w:p>
+      <w:pPr>
+        <w:pStyle w:val="Heading2"/>
+      </w:pPr>
+      <w:r>
+        <w:t>Work order for terra</w:t>
+      </w:r>
+    </w:p>
+    <w:p>
+      <w:r>
+        <w:t>Pass 1: Inspect latest source/instructions, record baseline metrics, add versioned state migration and flag evaluation, then build the expanded routes with unadorned clearings. Prove access to old objectives and intended gates before adding scenery.</w:t>
+      </w:r>
+    </w:p>
+    <w:p>
+      <w:r>
+        <w:t>Pass 2: Implement Artemis's entry conversation and existing-healing recognition. Build one complete Moon Lens interaction and west-sluice/west-ridge returns. Exercise actual keyboard holds, accessibility input and save/resume midway. This is the representative slice.</w:t>
+      </w:r>
+    </w:p>
+    <w:p>
+      <w:r>
+        <w:t>Pass 3: Add the eastern relic branch, persistent three-anchor spool repairs, southern latch, acorn planting, ridge descent and final return/song. Reuse the tested state/event pattern rather than making each gate a special case.</w:t>
+      </w:r>
+    </w:p>
+    <w:p>
+      <w:r>
+        <w:t>Pass 4: Add differentiated terrain, signs, local music cues and restoration effects. Inspect camera visibility at every interaction and both shortcut approaches; limit distant simulation and profile enlarged geometry/collision before choosing optimization work.</w:t>
+      </w:r>
+    </w:p>
+    <w:p>
+      <w:r>
+        <w:t>Pass 5: Run the acceptance checks below, update the design record from planned to implemented/verified with actual evidence, and publish complete editable source to the authorized repository. Preserve project.godot, both scenes, source assets and generation tools. Do not report planned dimensions or counters as tested results.</w:t>
+      </w:r>
+    </w:p>
+    <w:p>
+      <w:pPr>
+        <w:pStyle w:val="Heading2"/>
+      </w:pPr>
+      <w:r>
+        <w:t>Acceptance and failure cases</w:t>
+      </w:r>
+    </w:p>
+    <w:p>
+      <w:r>
+        <w:t>Measure roughly 3x area and route length with the same units as the baseline; report distinct walkable coverage separately. Record each of nine shortcut endpoints, unlock and before/after route distance. Check both branch orders, early visits, return after each relic, all locked floor regions and accidental corridor overlaps. No item may be locked behind its own requirement.</w:t>
+      </w:r>
+    </w:p>
+    <w:p>
+      <w:r>
+        <w:t>Run a continuous actual-controller quest from selection through Artemis's final meeting, with zero spatial relocations for the progression claim. Walk every new route and shortcut in both directions using normal collision. Full-floor reachability tests must distinguish initial, source-restored, each relic, planted and completed states. Test large-frame movement against closed gates.</w:t>
+      </w:r>
+    </w:p>
+    <w:p>
+      <w:r>
+        <w:t>Save and reload at each major unlock, midway through an anchor repair, with the acorn carried, immediately after planting, and after completion. Test version-1 migration with a finished old level and an unfinished one, malformed IDs, duplicate actions and invalid positions. Prove the first valley save is unchanged.</w:t>
+      </w:r>
+    </w:p>
+    <w:p>
+      <w:r>
+        <w:t>Verify lens pitch classes across octaves; interrupted, wrong-note and toggle-hold behavior; pause/mute/focus cleanup; journal truthfulness; permanent opened geometry; and restoration visibility from the ordinary camera. Re-run both existing level suites and native instrument checks. Capture real Godot before/after views and the new map. State whether screenshots use arranged fixtures and whether traversal uses relocations.</w:t>
+      </w:r>
+    </w:p>
+    <w:p>
+      <w:r>
+        <w:t>Suggested human playtest questions: Are distant goals recognizable? Does each revisit change the player's route or understanding? Are the quiet stretches pleasant rather than confusing? Can a player identify what a relic will affect before pressing E? Automated traversal cannot answer these questions.</w:t>
+      </w:r>
+    </w:p>
+    <w:p>
+      <w:pPr>
+        <w:pStyle w:val="Heading2"/>
+      </w:pPr>
+      <w:r>
+        <w:t>Status</w:t>
+      </w:r>
+    </w:p>
+    <w:p>
+      <w:r>
+        <w:t>This handoff plans the next milestone. No enlarged map, new relic, Artemis quest, migration or performance result is claimed as implemented. User goals are authorized; specific AI tuning choices remain revisable during Terra's blockout and representative slice.</w:t>
+      </w:r>
+    </w:p>
     <w:sectPr>
       <w:footerReference w:type="default" r:id="rId9"/>
       <w:pgSz w:w="12240" w:h="15840"/>

</xml_diff>